<commit_message>
chore: ignore Office lock files (~$*) and untrack stray Word lock
Co-authored-by: Cursor <cursoragent@cursor.com>
</commit_message>
<xml_diff>
--- a/LetterGenerator_V1.2.5_Portable/templates/תחשיב זכויות אישי.docx
+++ b/LetterGenerator_V1.2.5_Portable/templates/תחשיב זכויות אישי.docx
@@ -270,11 +270,19 @@
                   <w:vAlign w:val="center"/>
                 </w:tcPr>
                 <w:p>
+                  <w:proofErr w:type="gramStart"/>
                   <w:r>
                     <w:rPr>
                       <w:lang w:val="en-US" w:bidi="en-US"/>
                     </w:rPr>
-                    <w:t>‎{{ H }}</w:t>
+                    <w:t>‎{{ H</w:t>
+                  </w:r>
+                  <w:proofErr w:type="gramEnd"/>
+                  <w:r>
+                    <w:rPr>
+                      <w:lang w:val="en-US" w:bidi="en-US"/>
+                    </w:rPr>
+                    <w:t xml:space="preserve"> }}</w:t>
                   </w:r>
                 </w:p>
               </w:tc>
@@ -441,12 +449,21 @@
                   <w:vAlign w:val="center"/>
                 </w:tcPr>
                 <w:p>
+                  <w:proofErr w:type="gramStart"/>
                   <w:r>
                     <w:rPr>
                       <w:b/>
                       <w:lang w:val="en-US" w:bidi="en-US"/>
                     </w:rPr>
-                    <w:t>‎{{ J }}</w:t>
+                    <w:t>‎{{ J</w:t>
+                  </w:r>
+                  <w:proofErr w:type="gramEnd"/>
+                  <w:r>
+                    <w:rPr>
+                      <w:b/>
+                      <w:lang w:val="en-US" w:bidi="en-US"/>
+                    </w:rPr>
+                    <w:t xml:space="preserve"> }}</w:t>
                   </w:r>
                 </w:p>
               </w:tc>
@@ -523,11 +540,19 @@
                   <w:vAlign w:val="center"/>
                 </w:tcPr>
                 <w:p>
+                  <w:proofErr w:type="gramStart"/>
                   <w:r>
                     <w:rPr>
                       <w:lang w:val="en-US" w:bidi="en-US"/>
                     </w:rPr>
-                    <w:t>‎{{ I }}</w:t>
+                    <w:t>‎{{ I</w:t>
+                  </w:r>
+                  <w:proofErr w:type="gramEnd"/>
+                  <w:r>
+                    <w:rPr>
+                      <w:lang w:val="en-US" w:bidi="en-US"/>
+                    </w:rPr>
+                    <w:t xml:space="preserve"> }}</w:t>
                   </w:r>
                 </w:p>
               </w:tc>
@@ -649,11 +674,19 @@
                   <w:vAlign w:val="center"/>
                 </w:tcPr>
                 <w:p>
+                  <w:proofErr w:type="gramStart"/>
                   <w:r>
                     <w:rPr>
                       <w:lang w:val="en-US" w:bidi="en-US"/>
                     </w:rPr>
-                    <w:t>‎{{ L }}</w:t>
+                    <w:t>‎{{ L</w:t>
+                  </w:r>
+                  <w:proofErr w:type="gramEnd"/>
+                  <w:r>
+                    <w:rPr>
+                      <w:lang w:val="en-US" w:bidi="en-US"/>
+                    </w:rPr>
+                    <w:t xml:space="preserve"> }}</w:t>
                   </w:r>
                 </w:p>
               </w:tc>
@@ -829,12 +862,21 @@
                   <w:vAlign w:val="center"/>
                 </w:tcPr>
                 <w:p>
+                  <w:proofErr w:type="gramStart"/>
                   <w:r>
                     <w:rPr>
                       <w:b/>
                       <w:lang w:val="en-US" w:bidi="en-US"/>
                     </w:rPr>
-                    <w:t>‎{{ M }}</w:t>
+                    <w:t>‎{{ M</w:t>
+                  </w:r>
+                  <w:proofErr w:type="gramEnd"/>
+                  <w:r>
+                    <w:rPr>
+                      <w:b/>
+                      <w:lang w:val="en-US" w:bidi="en-US"/>
+                    </w:rPr>
+                    <w:t xml:space="preserve"> }}</w:t>
                   </w:r>
                 </w:p>
               </w:tc>
@@ -1010,12 +1052,21 @@
                   <w:vAlign w:val="center"/>
                 </w:tcPr>
                 <w:p>
+                  <w:proofErr w:type="gramStart"/>
                   <w:r>
                     <w:rPr>
                       <w:b/>
                       <w:lang w:val="en-US" w:bidi="en-US"/>
                     </w:rPr>
-                    <w:t>‎{{ M }}</w:t>
+                    <w:t>‎{{ M</w:t>
+                  </w:r>
+                  <w:proofErr w:type="gramEnd"/>
+                  <w:r>
+                    <w:rPr>
+                      <w:b/>
+                      <w:lang w:val="en-US" w:bidi="en-US"/>
+                    </w:rPr>
+                    <w:t xml:space="preserve"> }}</w:t>
                   </w:r>
                 </w:p>
               </w:tc>
@@ -1182,11 +1233,19 @@
                   <w:vAlign w:val="center"/>
                 </w:tcPr>
                 <w:p>
+                  <w:proofErr w:type="gramStart"/>
                   <w:r>
                     <w:rPr>
                       <w:lang w:val="en-US" w:bidi="en-US"/>
                     </w:rPr>
-                    <w:t>‎{{ O }}</w:t>
+                    <w:t>‎{{ O</w:t>
+                  </w:r>
+                  <w:proofErr w:type="gramEnd"/>
+                  <w:r>
+                    <w:rPr>
+                      <w:lang w:val="en-US" w:bidi="en-US"/>
+                    </w:rPr>
+                    <w:t xml:space="preserve"> }}</w:t>
                   </w:r>
                 </w:p>
               </w:tc>
@@ -1363,12 +1422,21 @@
                   <w:vAlign w:val="center"/>
                 </w:tcPr>
                 <w:p>
+                  <w:proofErr w:type="gramStart"/>
                   <w:r>
                     <w:rPr>
                       <w:b/>
                       <w:lang w:val="en-US" w:bidi="en-US"/>
                     </w:rPr>
-                    <w:t>‎{{ P }}</w:t>
+                    <w:t>‎{{ P</w:t>
+                  </w:r>
+                  <w:proofErr w:type="gramEnd"/>
+                  <w:r>
+                    <w:rPr>
+                      <w:b/>
+                      <w:lang w:val="en-US" w:bidi="en-US"/>
+                    </w:rPr>
+                    <w:t xml:space="preserve"> }}</w:t>
                   </w:r>
                 </w:p>
               </w:tc>
@@ -1496,12 +1564,150 @@
           <w:bCs/>
         </w:rPr>
       </w:pPr>
+      <w:proofErr w:type="spellStart"/>
       <w:r>
         <w:rPr>
           <w:rtl w:val="0"/>
           <w:lang w:val="en-US"/>
         </w:rPr>
-        <w:t>התוספת היא אחת לכל מקרה פטירה ושווה לסך של תוספת נפטרים</w:t>
+        <w:t>התוספת</w:t>
+      </w:r>
+      <w:proofErr w:type="spellEnd"/>
+      <w:r>
+        <w:rPr>
+          <w:rtl w:val="0"/>
+          <w:lang w:val="en-US"/>
+        </w:rPr>
+        <w:t xml:space="preserve"> </w:t>
+      </w:r>
+      <w:proofErr w:type="spellStart"/>
+      <w:r>
+        <w:rPr>
+          <w:rtl w:val="0"/>
+          <w:lang w:val="en-US"/>
+        </w:rPr>
+        <w:t>היא</w:t>
+      </w:r>
+      <w:proofErr w:type="spellEnd"/>
+      <w:r>
+        <w:rPr>
+          <w:rtl w:val="0"/>
+          <w:lang w:val="en-US"/>
+        </w:rPr>
+        <w:t xml:space="preserve"> </w:t>
+      </w:r>
+      <w:proofErr w:type="spellStart"/>
+      <w:r>
+        <w:rPr>
+          <w:rtl w:val="0"/>
+          <w:lang w:val="en-US"/>
+        </w:rPr>
+        <w:t>אחת</w:t>
+      </w:r>
+      <w:proofErr w:type="spellEnd"/>
+      <w:r>
+        <w:rPr>
+          <w:rtl w:val="0"/>
+          <w:lang w:val="en-US"/>
+        </w:rPr>
+        <w:t xml:space="preserve"> </w:t>
+      </w:r>
+      <w:proofErr w:type="spellStart"/>
+      <w:r>
+        <w:rPr>
+          <w:rtl w:val="0"/>
+          <w:lang w:val="en-US"/>
+        </w:rPr>
+        <w:t>לכל</w:t>
+      </w:r>
+      <w:proofErr w:type="spellEnd"/>
+      <w:r>
+        <w:rPr>
+          <w:rtl w:val="0"/>
+          <w:lang w:val="en-US"/>
+        </w:rPr>
+        <w:t xml:space="preserve"> </w:t>
+      </w:r>
+      <w:proofErr w:type="spellStart"/>
+      <w:r>
+        <w:rPr>
+          <w:rtl w:val="0"/>
+          <w:lang w:val="en-US"/>
+        </w:rPr>
+        <w:t>מקרה</w:t>
+      </w:r>
+      <w:proofErr w:type="spellEnd"/>
+      <w:r>
+        <w:rPr>
+          <w:rtl w:val="0"/>
+          <w:lang w:val="en-US"/>
+        </w:rPr>
+        <w:t xml:space="preserve"> </w:t>
+      </w:r>
+      <w:proofErr w:type="spellStart"/>
+      <w:r>
+        <w:rPr>
+          <w:rtl w:val="0"/>
+          <w:lang w:val="en-US"/>
+        </w:rPr>
+        <w:t>פטירה</w:t>
+      </w:r>
+      <w:proofErr w:type="spellEnd"/>
+      <w:r>
+        <w:rPr>
+          <w:rtl w:val="0"/>
+          <w:lang w:val="en-US"/>
+        </w:rPr>
+        <w:t xml:space="preserve"> </w:t>
+      </w:r>
+      <w:proofErr w:type="spellStart"/>
+      <w:r>
+        <w:rPr>
+          <w:rtl w:val="0"/>
+          <w:lang w:val="en-US"/>
+        </w:rPr>
+        <w:t>ושווה</w:t>
+      </w:r>
+      <w:proofErr w:type="spellEnd"/>
+      <w:r>
+        <w:rPr>
+          <w:rtl w:val="0"/>
+          <w:lang w:val="en-US"/>
+        </w:rPr>
+        <w:t xml:space="preserve"> </w:t>
+      </w:r>
+      <w:proofErr w:type="spellStart"/>
+      <w:r>
+        <w:rPr>
+          <w:rtl w:val="0"/>
+          <w:lang w:val="en-US"/>
+        </w:rPr>
+        <w:t>לסך</w:t>
+      </w:r>
+      <w:proofErr w:type="spellEnd"/>
+      <w:r>
+        <w:rPr>
+          <w:rtl w:val="0"/>
+          <w:lang w:val="en-US"/>
+        </w:rPr>
+        <w:t xml:space="preserve"> </w:t>
+      </w:r>
+      <w:proofErr w:type="spellStart"/>
+      <w:proofErr w:type="gramStart"/>
+      <w:r>
+        <w:rPr>
+          <w:rtl w:val="0"/>
+          <w:lang w:val="en-US"/>
+        </w:rPr>
+        <w:t>של</w:t>
+      </w:r>
+      <w:proofErr w:type="spellEnd"/>
+      <w:r>
+        <w:rPr>
+          <w:rtl w:val="0"/>
+          <w:lang w:val="en-US"/>
+        </w:rPr>
+        <w:t xml:space="preserve"> </w:t>
       </w:r>
       <w:r>
         <w:rPr>
@@ -1511,31 +1717,21 @@
         <w:t xml:space="preserve"> </w:t>
       </w:r>
       <w:r>
+        <w:t>{</w:t>
+      </w:r>
+      <w:proofErr w:type="gramEnd"/>
+      <w:r>
+        <w:t>{</w:t>
+      </w:r>
+      <w:r>
         <w:rPr>
           <w:rtl w:val="0"/>
           <w:lang w:val="en-US"/>
         </w:rPr>
-        <w:t xml:space="preserve"> </w:t>
-      </w:r>
-      <w:r>
-        <w:t>{{</w:t>
-      </w:r>
-      <w:r>
-        <w:rPr>
-          <w:rtl w:val="0"/>
-          <w:lang w:val="en-US"/>
-        </w:rPr>
         <w:t>L</w:t>
       </w:r>
       <w:r>
         <w:t>}}</w:t>
-      </w:r>
-      <w:r>
-        <w:rPr>
-          <w:rtl w:val="0"/>
-          <w:lang w:val="en-US"/>
-        </w:rPr>
-        <w:t>)</w:t>
       </w:r>
       <w:r>
         <w:rPr>
@@ -1544,14 +1740,226 @@
           <w:rtl w:val="0"/>
           <w:lang w:val="en-US"/>
         </w:rPr>
-        <w:t xml:space="preserve"> ₪ </w:t>
-      </w:r>
-      <w:r>
-        <w:rPr>
+        <w:t xml:space="preserve"> </w:t>
+      </w:r>
+      <w:proofErr w:type="gramStart"/>
+      <w:r>
+        <w:rPr>
+          <w:b/>
+          <w:bCs/>
           <w:rtl w:val="0"/>
           <w:lang w:val="en-US"/>
         </w:rPr>
-        <w:t>(הסכום השווה), המתחלקים בין החברים הזכאים לאותה תוספת, עפ"י דף הפירוט שקיבלת.</w:t>
+        <w:t xml:space="preserve">₪ </w:t>
+      </w:r>
+      <w:r>
+        <w:rPr>
+          <w:rFonts w:hint="cs"/>
+          <w:b/>
+          <w:bCs/>
+          <w:lang w:val="en-US"/>
+        </w:rPr>
+        <w:t xml:space="preserve"> </w:t>
+      </w:r>
+      <w:r>
+        <w:rPr>
+          <w:rtl w:val="0"/>
+          <w:lang w:val="en-US"/>
+        </w:rPr>
+        <w:t>(</w:t>
+      </w:r>
+      <w:proofErr w:type="spellStart"/>
+      <w:proofErr w:type="gramEnd"/>
+      <w:r>
+        <w:rPr>
+          <w:rtl w:val="0"/>
+          <w:lang w:val="en-US"/>
+        </w:rPr>
+        <w:t>הסכום</w:t>
+      </w:r>
+      <w:proofErr w:type="spellEnd"/>
+      <w:r>
+        <w:rPr>
+          <w:rtl w:val="0"/>
+          <w:lang w:val="en-US"/>
+        </w:rPr>
+        <w:t xml:space="preserve"> </w:t>
+      </w:r>
+      <w:proofErr w:type="spellStart"/>
+      <w:r>
+        <w:rPr>
+          <w:rtl w:val="0"/>
+          <w:lang w:val="en-US"/>
+        </w:rPr>
+        <w:t>השווה</w:t>
+      </w:r>
+      <w:proofErr w:type="spellEnd"/>
+      <w:r>
+        <w:rPr>
+          <w:rtl w:val="0"/>
+          <w:lang w:val="en-US"/>
+        </w:rPr>
+        <w:t xml:space="preserve">), </w:t>
+      </w:r>
+      <w:proofErr w:type="spellStart"/>
+      <w:r>
+        <w:rPr>
+          <w:rtl w:val="0"/>
+          <w:lang w:val="en-US"/>
+        </w:rPr>
+        <w:t>המתחלקים</w:t>
+      </w:r>
+      <w:proofErr w:type="spellEnd"/>
+      <w:r>
+        <w:rPr>
+          <w:rtl w:val="0"/>
+          <w:lang w:val="en-US"/>
+        </w:rPr>
+        <w:t xml:space="preserve"> </w:t>
+      </w:r>
+      <w:proofErr w:type="spellStart"/>
+      <w:r>
+        <w:rPr>
+          <w:rtl w:val="0"/>
+          <w:lang w:val="en-US"/>
+        </w:rPr>
+        <w:t>בין</w:t>
+      </w:r>
+      <w:proofErr w:type="spellEnd"/>
+      <w:r>
+        <w:rPr>
+          <w:rtl w:val="0"/>
+          <w:lang w:val="en-US"/>
+        </w:rPr>
+        <w:t xml:space="preserve"> </w:t>
+      </w:r>
+      <w:proofErr w:type="spellStart"/>
+      <w:r>
+        <w:rPr>
+          <w:rtl w:val="0"/>
+          <w:lang w:val="en-US"/>
+        </w:rPr>
+        <w:t>החברים</w:t>
+      </w:r>
+      <w:proofErr w:type="spellEnd"/>
+      <w:r>
+        <w:rPr>
+          <w:rtl w:val="0"/>
+          <w:lang w:val="en-US"/>
+        </w:rPr>
+        <w:t xml:space="preserve"> </w:t>
+      </w:r>
+      <w:proofErr w:type="spellStart"/>
+      <w:r>
+        <w:rPr>
+          <w:rtl w:val="0"/>
+          <w:lang w:val="en-US"/>
+        </w:rPr>
+        <w:t>הזכאים</w:t>
+      </w:r>
+      <w:proofErr w:type="spellEnd"/>
+      <w:r>
+        <w:rPr>
+          <w:rtl w:val="0"/>
+          <w:lang w:val="en-US"/>
+        </w:rPr>
+        <w:t xml:space="preserve"> </w:t>
+      </w:r>
+      <w:proofErr w:type="spellStart"/>
+      <w:r>
+        <w:rPr>
+          <w:rtl w:val="0"/>
+          <w:lang w:val="en-US"/>
+        </w:rPr>
+        <w:t>לאותה</w:t>
+      </w:r>
+      <w:proofErr w:type="spellEnd"/>
+      <w:r>
+        <w:rPr>
+          <w:rtl w:val="0"/>
+          <w:lang w:val="en-US"/>
+        </w:rPr>
+        <w:t xml:space="preserve"> </w:t>
+      </w:r>
+      <w:proofErr w:type="spellStart"/>
+      <w:r>
+        <w:rPr>
+          <w:rtl w:val="0"/>
+          <w:lang w:val="en-US"/>
+        </w:rPr>
+        <w:t>תוספת</w:t>
+      </w:r>
+      <w:proofErr w:type="spellEnd"/>
+      <w:r>
+        <w:rPr>
+          <w:rtl w:val="0"/>
+          <w:lang w:val="en-US"/>
+        </w:rPr>
+        <w:t xml:space="preserve">, </w:t>
+      </w:r>
+      <w:proofErr w:type="spellStart"/>
+      <w:r>
+        <w:rPr>
+          <w:rtl w:val="0"/>
+          <w:lang w:val="en-US"/>
+        </w:rPr>
+        <w:t>עפ"י</w:t>
+      </w:r>
+      <w:proofErr w:type="spellEnd"/>
+      <w:r>
+        <w:rPr>
+          <w:rtl w:val="0"/>
+          <w:lang w:val="en-US"/>
+        </w:rPr>
+        <w:t xml:space="preserve"> </w:t>
+      </w:r>
+      <w:proofErr w:type="spellStart"/>
+      <w:r>
+        <w:rPr>
+          <w:rtl w:val="0"/>
+          <w:lang w:val="en-US"/>
+        </w:rPr>
+        <w:t>דף</w:t>
+      </w:r>
+      <w:proofErr w:type="spellEnd"/>
+      <w:r>
+        <w:rPr>
+          <w:rtl w:val="0"/>
+          <w:lang w:val="en-US"/>
+        </w:rPr>
+        <w:t xml:space="preserve"> </w:t>
+      </w:r>
+      <w:proofErr w:type="spellStart"/>
+      <w:r>
+        <w:rPr>
+          <w:rtl w:val="0"/>
+          <w:lang w:val="en-US"/>
+        </w:rPr>
+        <w:t>הפירוט</w:t>
+      </w:r>
+      <w:proofErr w:type="spellEnd"/>
+      <w:r>
+        <w:rPr>
+          <w:rtl w:val="0"/>
+          <w:lang w:val="en-US"/>
+        </w:rPr>
+        <w:t xml:space="preserve"> </w:t>
+      </w:r>
+      <w:proofErr w:type="spellStart"/>
+      <w:r>
+        <w:rPr>
+          <w:rtl w:val="0"/>
+          <w:lang w:val="en-US"/>
+        </w:rPr>
+        <w:t>שקיבלת</w:t>
+      </w:r>
+      <w:proofErr w:type="spellEnd"/>
+      <w:r>
+        <w:rPr>
+          <w:rtl w:val="0"/>
+          <w:lang w:val="en-US"/>
+        </w:rPr>
+        <w:t>.</w:t>
       </w:r>
     </w:p>
     <w:p>
@@ -1629,12 +2037,805 @@
       <w:pPr>
         <w:pStyle w:val="LGNotes"/>
       </w:pPr>
+      <w:proofErr w:type="spellStart"/>
       <w:r>
         <w:rPr>
           <w:rtl w:val="0"/>
           <w:lang w:val="en-US"/>
         </w:rPr>
-        <w:t>כמי שהיה בתקופת קליטה במועד קבלת ההחלטה, זכאותך לקבלת הכספים תקום רק עם קבלתך לחברות בקיבוץ. היה ולא יתקבל לחברות, לא יהיה זכאי לקבלת הכספים או לכל חלק מהם. לפיכך, רק עם קבלתך לחברות, הנהלת חשבונות תעביר לרשותך את הסכום המצוין בתחשיב (בתקופה זו סכום זה יישמר עבורך, בערכו הנומינאלי).</w:t>
+        <w:t>כמי</w:t>
+      </w:r>
+      <w:proofErr w:type="spellEnd"/>
+      <w:r>
+        <w:rPr>
+          <w:rtl w:val="0"/>
+          <w:lang w:val="en-US"/>
+        </w:rPr>
+        <w:t xml:space="preserve"> </w:t>
+      </w:r>
+      <w:proofErr w:type="spellStart"/>
+      <w:r>
+        <w:rPr>
+          <w:rtl w:val="0"/>
+          <w:lang w:val="en-US"/>
+        </w:rPr>
+        <w:t>שהיה</w:t>
+      </w:r>
+      <w:proofErr w:type="spellEnd"/>
+      <w:r>
+        <w:rPr>
+          <w:rtl w:val="0"/>
+          <w:lang w:val="en-US"/>
+        </w:rPr>
+        <w:t xml:space="preserve"> </w:t>
+      </w:r>
+      <w:proofErr w:type="spellStart"/>
+      <w:r>
+        <w:rPr>
+          <w:rtl w:val="0"/>
+          <w:lang w:val="en-US"/>
+        </w:rPr>
+        <w:t>בתקופת</w:t>
+      </w:r>
+      <w:proofErr w:type="spellEnd"/>
+      <w:r>
+        <w:rPr>
+          <w:rtl w:val="0"/>
+          <w:lang w:val="en-US"/>
+        </w:rPr>
+        <w:t xml:space="preserve"> </w:t>
+      </w:r>
+      <w:proofErr w:type="spellStart"/>
+      <w:r>
+        <w:rPr>
+          <w:rtl w:val="0"/>
+          <w:lang w:val="en-US"/>
+        </w:rPr>
+        <w:t>קליטה</w:t>
+      </w:r>
+      <w:proofErr w:type="spellEnd"/>
+      <w:r>
+        <w:rPr>
+          <w:rtl w:val="0"/>
+          <w:lang w:val="en-US"/>
+        </w:rPr>
+        <w:t xml:space="preserve"> </w:t>
+      </w:r>
+      <w:proofErr w:type="spellStart"/>
+      <w:r>
+        <w:rPr>
+          <w:rtl w:val="0"/>
+          <w:lang w:val="en-US"/>
+        </w:rPr>
+        <w:t>במועד</w:t>
+      </w:r>
+      <w:proofErr w:type="spellEnd"/>
+      <w:r>
+        <w:rPr>
+          <w:rtl w:val="0"/>
+          <w:lang w:val="en-US"/>
+        </w:rPr>
+        <w:t xml:space="preserve"> </w:t>
+      </w:r>
+      <w:proofErr w:type="spellStart"/>
+      <w:r>
+        <w:rPr>
+          <w:rtl w:val="0"/>
+          <w:lang w:val="en-US"/>
+        </w:rPr>
+        <w:t>קבלת</w:t>
+      </w:r>
+      <w:proofErr w:type="spellEnd"/>
+      <w:r>
+        <w:rPr>
+          <w:rtl w:val="0"/>
+          <w:lang w:val="en-US"/>
+        </w:rPr>
+        <w:t xml:space="preserve"> </w:t>
+      </w:r>
+      <w:proofErr w:type="spellStart"/>
+      <w:r>
+        <w:rPr>
+          <w:rtl w:val="0"/>
+          <w:lang w:val="en-US"/>
+        </w:rPr>
+        <w:t>ההחלטה</w:t>
+      </w:r>
+      <w:proofErr w:type="spellEnd"/>
+      <w:r>
+        <w:rPr>
+          <w:rtl w:val="0"/>
+          <w:lang w:val="en-US"/>
+        </w:rPr>
+        <w:t xml:space="preserve">, </w:t>
+      </w:r>
+      <w:proofErr w:type="spellStart"/>
+      <w:r>
+        <w:rPr>
+          <w:rtl w:val="0"/>
+          <w:lang w:val="en-US"/>
+        </w:rPr>
+        <w:t>זכאותך</w:t>
+      </w:r>
+      <w:proofErr w:type="spellEnd"/>
+      <w:r>
+        <w:rPr>
+          <w:rtl w:val="0"/>
+          <w:lang w:val="en-US"/>
+        </w:rPr>
+        <w:t xml:space="preserve"> </w:t>
+      </w:r>
+      <w:proofErr w:type="spellStart"/>
+      <w:r>
+        <w:rPr>
+          <w:rtl w:val="0"/>
+          <w:lang w:val="en-US"/>
+        </w:rPr>
+        <w:t>לקבלת</w:t>
+      </w:r>
+      <w:proofErr w:type="spellEnd"/>
+      <w:r>
+        <w:rPr>
+          <w:rtl w:val="0"/>
+          <w:lang w:val="en-US"/>
+        </w:rPr>
+        <w:t xml:space="preserve"> </w:t>
+      </w:r>
+      <w:proofErr w:type="spellStart"/>
+      <w:r>
+        <w:rPr>
+          <w:rtl w:val="0"/>
+          <w:lang w:val="en-US"/>
+        </w:rPr>
+        <w:t>הכספים</w:t>
+      </w:r>
+      <w:proofErr w:type="spellEnd"/>
+      <w:r>
+        <w:rPr>
+          <w:rtl w:val="0"/>
+          <w:lang w:val="en-US"/>
+        </w:rPr>
+        <w:t xml:space="preserve"> </w:t>
+      </w:r>
+      <w:proofErr w:type="spellStart"/>
+      <w:r>
+        <w:rPr>
+          <w:rtl w:val="0"/>
+          <w:lang w:val="en-US"/>
+        </w:rPr>
+        <w:t>תקום</w:t>
+      </w:r>
+      <w:proofErr w:type="spellEnd"/>
+      <w:r>
+        <w:rPr>
+          <w:rtl w:val="0"/>
+          <w:lang w:val="en-US"/>
+        </w:rPr>
+        <w:t xml:space="preserve"> </w:t>
+      </w:r>
+      <w:proofErr w:type="spellStart"/>
+      <w:r>
+        <w:rPr>
+          <w:rtl w:val="0"/>
+          <w:lang w:val="en-US"/>
+        </w:rPr>
+        <w:t>רק</w:t>
+      </w:r>
+      <w:proofErr w:type="spellEnd"/>
+      <w:r>
+        <w:rPr>
+          <w:rtl w:val="0"/>
+          <w:lang w:val="en-US"/>
+        </w:rPr>
+        <w:t xml:space="preserve"> </w:t>
+      </w:r>
+      <w:proofErr w:type="spellStart"/>
+      <w:r>
+        <w:rPr>
+          <w:rtl w:val="0"/>
+          <w:lang w:val="en-US"/>
+        </w:rPr>
+        <w:t>עם</w:t>
+      </w:r>
+      <w:proofErr w:type="spellEnd"/>
+      <w:r>
+        <w:rPr>
+          <w:rtl w:val="0"/>
+          <w:lang w:val="en-US"/>
+        </w:rPr>
+        <w:t xml:space="preserve"> </w:t>
+      </w:r>
+      <w:proofErr w:type="spellStart"/>
+      <w:r>
+        <w:rPr>
+          <w:rtl w:val="0"/>
+          <w:lang w:val="en-US"/>
+        </w:rPr>
+        <w:t>קבלתך</w:t>
+      </w:r>
+      <w:proofErr w:type="spellEnd"/>
+      <w:r>
+        <w:rPr>
+          <w:rtl w:val="0"/>
+          <w:lang w:val="en-US"/>
+        </w:rPr>
+        <w:t xml:space="preserve"> </w:t>
+      </w:r>
+      <w:proofErr w:type="spellStart"/>
+      <w:r>
+        <w:rPr>
+          <w:rtl w:val="0"/>
+          <w:lang w:val="en-US"/>
+        </w:rPr>
+        <w:t>לחברות</w:t>
+      </w:r>
+      <w:proofErr w:type="spellEnd"/>
+      <w:r>
+        <w:rPr>
+          <w:rtl w:val="0"/>
+          <w:lang w:val="en-US"/>
+        </w:rPr>
+        <w:t xml:space="preserve"> </w:t>
+      </w:r>
+      <w:proofErr w:type="spellStart"/>
+      <w:r>
+        <w:rPr>
+          <w:rtl w:val="0"/>
+          <w:lang w:val="en-US"/>
+        </w:rPr>
+        <w:t>בקיבוץ</w:t>
+      </w:r>
+      <w:proofErr w:type="spellEnd"/>
+      <w:r>
+        <w:rPr>
+          <w:rtl w:val="0"/>
+          <w:lang w:val="en-US"/>
+        </w:rPr>
+        <w:t xml:space="preserve">. </w:t>
+      </w:r>
+      <w:proofErr w:type="spellStart"/>
+      <w:r>
+        <w:rPr>
+          <w:rtl w:val="0"/>
+          <w:lang w:val="en-US"/>
+        </w:rPr>
+        <w:t>היה</w:t>
+      </w:r>
+      <w:proofErr w:type="spellEnd"/>
+      <w:r>
+        <w:rPr>
+          <w:rtl w:val="0"/>
+          <w:lang w:val="en-US"/>
+        </w:rPr>
+        <w:t xml:space="preserve"> </w:t>
+      </w:r>
+      <w:proofErr w:type="spellStart"/>
+      <w:r>
+        <w:rPr>
+          <w:rtl w:val="0"/>
+          <w:lang w:val="en-US"/>
+        </w:rPr>
+        <w:t>ולא</w:t>
+      </w:r>
+      <w:proofErr w:type="spellEnd"/>
+      <w:r>
+        <w:rPr>
+          <w:rtl w:val="0"/>
+          <w:lang w:val="en-US"/>
+        </w:rPr>
+        <w:t xml:space="preserve"> </w:t>
+      </w:r>
+      <w:proofErr w:type="spellStart"/>
+      <w:r>
+        <w:rPr>
+          <w:rtl w:val="0"/>
+          <w:lang w:val="en-US"/>
+        </w:rPr>
+        <w:t>יתקבל</w:t>
+      </w:r>
+      <w:proofErr w:type="spellEnd"/>
+      <w:r>
+        <w:rPr>
+          <w:rtl w:val="0"/>
+          <w:lang w:val="en-US"/>
+        </w:rPr>
+        <w:t xml:space="preserve"> </w:t>
+      </w:r>
+      <w:proofErr w:type="spellStart"/>
+      <w:r>
+        <w:rPr>
+          <w:rtl w:val="0"/>
+          <w:lang w:val="en-US"/>
+        </w:rPr>
+        <w:t>לחברות</w:t>
+      </w:r>
+      <w:proofErr w:type="spellEnd"/>
+      <w:r>
+        <w:rPr>
+          <w:rtl w:val="0"/>
+          <w:lang w:val="en-US"/>
+        </w:rPr>
+        <w:t xml:space="preserve">, </w:t>
+      </w:r>
+      <w:proofErr w:type="spellStart"/>
+      <w:r>
+        <w:rPr>
+          <w:rtl w:val="0"/>
+          <w:lang w:val="en-US"/>
+        </w:rPr>
+        <w:t>לא</w:t>
+      </w:r>
+      <w:proofErr w:type="spellEnd"/>
+      <w:r>
+        <w:rPr>
+          <w:rtl w:val="0"/>
+          <w:lang w:val="en-US"/>
+        </w:rPr>
+        <w:t xml:space="preserve"> </w:t>
+      </w:r>
+      <w:proofErr w:type="spellStart"/>
+      <w:r>
+        <w:rPr>
+          <w:rtl w:val="0"/>
+          <w:lang w:val="en-US"/>
+        </w:rPr>
+        <w:t>יהיה</w:t>
+      </w:r>
+      <w:proofErr w:type="spellEnd"/>
+      <w:r>
+        <w:rPr>
+          <w:rtl w:val="0"/>
+          <w:lang w:val="en-US"/>
+        </w:rPr>
+        <w:t xml:space="preserve"> </w:t>
+      </w:r>
+      <w:proofErr w:type="spellStart"/>
+      <w:r>
+        <w:rPr>
+          <w:rtl w:val="0"/>
+          <w:lang w:val="en-US"/>
+        </w:rPr>
+        <w:t>זכאי</w:t>
+      </w:r>
+      <w:proofErr w:type="spellEnd"/>
+      <w:r>
+        <w:rPr>
+          <w:rtl w:val="0"/>
+          <w:lang w:val="en-US"/>
+        </w:rPr>
+        <w:t xml:space="preserve"> </w:t>
+      </w:r>
+      <w:proofErr w:type="spellStart"/>
+      <w:r>
+        <w:rPr>
+          <w:rtl w:val="0"/>
+          <w:lang w:val="en-US"/>
+        </w:rPr>
+        <w:t>לקבלת</w:t>
+      </w:r>
+      <w:proofErr w:type="spellEnd"/>
+      <w:r>
+        <w:rPr>
+          <w:rtl w:val="0"/>
+          <w:lang w:val="en-US"/>
+        </w:rPr>
+        <w:t xml:space="preserve"> </w:t>
+      </w:r>
+      <w:proofErr w:type="spellStart"/>
+      <w:r>
+        <w:rPr>
+          <w:rtl w:val="0"/>
+          <w:lang w:val="en-US"/>
+        </w:rPr>
+        <w:t>הכספים</w:t>
+      </w:r>
+      <w:proofErr w:type="spellEnd"/>
+      <w:r>
+        <w:rPr>
+          <w:rtl w:val="0"/>
+          <w:lang w:val="en-US"/>
+        </w:rPr>
+        <w:t xml:space="preserve"> </w:t>
+      </w:r>
+      <w:proofErr w:type="spellStart"/>
+      <w:r>
+        <w:rPr>
+          <w:rtl w:val="0"/>
+          <w:lang w:val="en-US"/>
+        </w:rPr>
+        <w:t>או</w:t>
+      </w:r>
+      <w:proofErr w:type="spellEnd"/>
+      <w:r>
+        <w:rPr>
+          <w:rtl w:val="0"/>
+          <w:lang w:val="en-US"/>
+        </w:rPr>
+        <w:t xml:space="preserve"> </w:t>
+      </w:r>
+      <w:proofErr w:type="spellStart"/>
+      <w:r>
+        <w:rPr>
+          <w:rtl w:val="0"/>
+          <w:lang w:val="en-US"/>
+        </w:rPr>
+        <w:t>לכל</w:t>
+      </w:r>
+      <w:proofErr w:type="spellEnd"/>
+      <w:r>
+        <w:rPr>
+          <w:rtl w:val="0"/>
+          <w:lang w:val="en-US"/>
+        </w:rPr>
+        <w:t xml:space="preserve"> </w:t>
+      </w:r>
+      <w:proofErr w:type="spellStart"/>
+      <w:r>
+        <w:rPr>
+          <w:rtl w:val="0"/>
+          <w:lang w:val="en-US"/>
+        </w:rPr>
+        <w:t>חלק</w:t>
+      </w:r>
+      <w:proofErr w:type="spellEnd"/>
+      <w:r>
+        <w:rPr>
+          <w:rtl w:val="0"/>
+          <w:lang w:val="en-US"/>
+        </w:rPr>
+        <w:t xml:space="preserve"> </w:t>
+      </w:r>
+      <w:proofErr w:type="spellStart"/>
+      <w:r>
+        <w:rPr>
+          <w:rtl w:val="0"/>
+          <w:lang w:val="en-US"/>
+        </w:rPr>
+        <w:t>מהם</w:t>
+      </w:r>
+      <w:proofErr w:type="spellEnd"/>
+      <w:r>
+        <w:rPr>
+          <w:rtl w:val="0"/>
+          <w:lang w:val="en-US"/>
+        </w:rPr>
+        <w:t xml:space="preserve">. </w:t>
+      </w:r>
+      <w:proofErr w:type="spellStart"/>
+      <w:r>
+        <w:rPr>
+          <w:rtl w:val="0"/>
+          <w:lang w:val="en-US"/>
+        </w:rPr>
+        <w:t>לפיכך</w:t>
+      </w:r>
+      <w:proofErr w:type="spellEnd"/>
+      <w:r>
+        <w:rPr>
+          <w:rtl w:val="0"/>
+          <w:lang w:val="en-US"/>
+        </w:rPr>
+        <w:t xml:space="preserve">, </w:t>
+      </w:r>
+      <w:proofErr w:type="spellStart"/>
+      <w:r>
+        <w:rPr>
+          <w:rtl w:val="0"/>
+          <w:lang w:val="en-US"/>
+        </w:rPr>
+        <w:t>רק</w:t>
+      </w:r>
+      <w:proofErr w:type="spellEnd"/>
+      <w:r>
+        <w:rPr>
+          <w:rtl w:val="0"/>
+          <w:lang w:val="en-US"/>
+        </w:rPr>
+        <w:t xml:space="preserve"> </w:t>
+      </w:r>
+      <w:proofErr w:type="spellStart"/>
+      <w:r>
+        <w:rPr>
+          <w:rtl w:val="0"/>
+          <w:lang w:val="en-US"/>
+        </w:rPr>
+        <w:t>עם</w:t>
+      </w:r>
+      <w:proofErr w:type="spellEnd"/>
+      <w:r>
+        <w:rPr>
+          <w:rtl w:val="0"/>
+          <w:lang w:val="en-US"/>
+        </w:rPr>
+        <w:t xml:space="preserve"> </w:t>
+      </w:r>
+      <w:proofErr w:type="spellStart"/>
+      <w:r>
+        <w:rPr>
+          <w:rtl w:val="0"/>
+          <w:lang w:val="en-US"/>
+        </w:rPr>
+        <w:t>קבלתך</w:t>
+      </w:r>
+      <w:proofErr w:type="spellEnd"/>
+      <w:r>
+        <w:rPr>
+          <w:rtl w:val="0"/>
+          <w:lang w:val="en-US"/>
+        </w:rPr>
+        <w:t xml:space="preserve"> </w:t>
+      </w:r>
+      <w:proofErr w:type="spellStart"/>
+      <w:r>
+        <w:rPr>
+          <w:rtl w:val="0"/>
+          <w:lang w:val="en-US"/>
+        </w:rPr>
+        <w:t>לחברות</w:t>
+      </w:r>
+      <w:proofErr w:type="spellEnd"/>
+      <w:r>
+        <w:rPr>
+          <w:rtl w:val="0"/>
+          <w:lang w:val="en-US"/>
+        </w:rPr>
+        <w:t xml:space="preserve">, </w:t>
+      </w:r>
+      <w:proofErr w:type="spellStart"/>
+      <w:r>
+        <w:rPr>
+          <w:rtl w:val="0"/>
+          <w:lang w:val="en-US"/>
+        </w:rPr>
+        <w:t>הנהלת</w:t>
+      </w:r>
+      <w:proofErr w:type="spellEnd"/>
+      <w:r>
+        <w:rPr>
+          <w:rtl w:val="0"/>
+          <w:lang w:val="en-US"/>
+        </w:rPr>
+        <w:t xml:space="preserve"> </w:t>
+      </w:r>
+      <w:proofErr w:type="spellStart"/>
+      <w:r>
+        <w:rPr>
+          <w:rtl w:val="0"/>
+          <w:lang w:val="en-US"/>
+        </w:rPr>
+        <w:t>חשבונות</w:t>
+      </w:r>
+      <w:proofErr w:type="spellEnd"/>
+      <w:r>
+        <w:rPr>
+          <w:rtl w:val="0"/>
+          <w:lang w:val="en-US"/>
+        </w:rPr>
+        <w:t xml:space="preserve"> </w:t>
+      </w:r>
+      <w:proofErr w:type="spellStart"/>
+      <w:r>
+        <w:rPr>
+          <w:rtl w:val="0"/>
+          <w:lang w:val="en-US"/>
+        </w:rPr>
+        <w:t>תעביר</w:t>
+      </w:r>
+      <w:proofErr w:type="spellEnd"/>
+      <w:r>
+        <w:rPr>
+          <w:rtl w:val="0"/>
+          <w:lang w:val="en-US"/>
+        </w:rPr>
+        <w:t xml:space="preserve"> </w:t>
+      </w:r>
+      <w:proofErr w:type="spellStart"/>
+      <w:r>
+        <w:rPr>
+          <w:rtl w:val="0"/>
+          <w:lang w:val="en-US"/>
+        </w:rPr>
+        <w:t>לרשותך</w:t>
+      </w:r>
+      <w:proofErr w:type="spellEnd"/>
+      <w:r>
+        <w:rPr>
+          <w:rtl w:val="0"/>
+          <w:lang w:val="en-US"/>
+        </w:rPr>
+        <w:t xml:space="preserve"> </w:t>
+      </w:r>
+      <w:proofErr w:type="spellStart"/>
+      <w:r>
+        <w:rPr>
+          <w:rtl w:val="0"/>
+          <w:lang w:val="en-US"/>
+        </w:rPr>
+        <w:t>את</w:t>
+      </w:r>
+      <w:proofErr w:type="spellEnd"/>
+      <w:r>
+        <w:rPr>
+          <w:rtl w:val="0"/>
+          <w:lang w:val="en-US"/>
+        </w:rPr>
+        <w:t xml:space="preserve"> </w:t>
+      </w:r>
+      <w:proofErr w:type="spellStart"/>
+      <w:r>
+        <w:rPr>
+          <w:rtl w:val="0"/>
+          <w:lang w:val="en-US"/>
+        </w:rPr>
+        <w:t>הסכום</w:t>
+      </w:r>
+      <w:proofErr w:type="spellEnd"/>
+      <w:r>
+        <w:rPr>
+          <w:rtl w:val="0"/>
+          <w:lang w:val="en-US"/>
+        </w:rPr>
+        <w:t xml:space="preserve"> </w:t>
+      </w:r>
+      <w:proofErr w:type="spellStart"/>
+      <w:r>
+        <w:rPr>
+          <w:rtl w:val="0"/>
+          <w:lang w:val="en-US"/>
+        </w:rPr>
+        <w:t>המצוין</w:t>
+      </w:r>
+      <w:proofErr w:type="spellEnd"/>
+      <w:r>
+        <w:rPr>
+          <w:rtl w:val="0"/>
+          <w:lang w:val="en-US"/>
+        </w:rPr>
+        <w:t xml:space="preserve"> </w:t>
+      </w:r>
+      <w:proofErr w:type="spellStart"/>
+      <w:r>
+        <w:rPr>
+          <w:rtl w:val="0"/>
+          <w:lang w:val="en-US"/>
+        </w:rPr>
+        <w:t>בתחשיב</w:t>
+      </w:r>
+      <w:proofErr w:type="spellEnd"/>
+      <w:r>
+        <w:rPr>
+          <w:rtl w:val="0"/>
+          <w:lang w:val="en-US"/>
+        </w:rPr>
+        <w:t xml:space="preserve"> (</w:t>
+      </w:r>
+      <w:proofErr w:type="spellStart"/>
+      <w:r>
+        <w:rPr>
+          <w:rtl w:val="0"/>
+          <w:lang w:val="en-US"/>
+        </w:rPr>
+        <w:t>בתקופה</w:t>
+      </w:r>
+      <w:proofErr w:type="spellEnd"/>
+      <w:r>
+        <w:rPr>
+          <w:rtl w:val="0"/>
+          <w:lang w:val="en-US"/>
+        </w:rPr>
+        <w:t xml:space="preserve"> </w:t>
+      </w:r>
+      <w:proofErr w:type="spellStart"/>
+      <w:r>
+        <w:rPr>
+          <w:rtl w:val="0"/>
+          <w:lang w:val="en-US"/>
+        </w:rPr>
+        <w:t>זו</w:t>
+      </w:r>
+      <w:proofErr w:type="spellEnd"/>
+      <w:r>
+        <w:rPr>
+          <w:rtl w:val="0"/>
+          <w:lang w:val="en-US"/>
+        </w:rPr>
+        <w:t xml:space="preserve"> </w:t>
+      </w:r>
+      <w:proofErr w:type="spellStart"/>
+      <w:r>
+        <w:rPr>
+          <w:rtl w:val="0"/>
+          <w:lang w:val="en-US"/>
+        </w:rPr>
+        <w:t>סכום</w:t>
+      </w:r>
+      <w:proofErr w:type="spellEnd"/>
+      <w:r>
+        <w:rPr>
+          <w:rtl w:val="0"/>
+          <w:lang w:val="en-US"/>
+        </w:rPr>
+        <w:t xml:space="preserve"> </w:t>
+      </w:r>
+      <w:proofErr w:type="spellStart"/>
+      <w:r>
+        <w:rPr>
+          <w:rtl w:val="0"/>
+          <w:lang w:val="en-US"/>
+        </w:rPr>
+        <w:t>זה</w:t>
+      </w:r>
+      <w:proofErr w:type="spellEnd"/>
+      <w:r>
+        <w:rPr>
+          <w:rtl w:val="0"/>
+          <w:lang w:val="en-US"/>
+        </w:rPr>
+        <w:t xml:space="preserve"> </w:t>
+      </w:r>
+      <w:proofErr w:type="spellStart"/>
+      <w:r>
+        <w:rPr>
+          <w:rtl w:val="0"/>
+          <w:lang w:val="en-US"/>
+        </w:rPr>
+        <w:t>יישמר</w:t>
+      </w:r>
+      <w:proofErr w:type="spellEnd"/>
+      <w:r>
+        <w:rPr>
+          <w:rtl w:val="0"/>
+          <w:lang w:val="en-US"/>
+        </w:rPr>
+        <w:t xml:space="preserve"> </w:t>
+      </w:r>
+      <w:proofErr w:type="spellStart"/>
+      <w:r>
+        <w:rPr>
+          <w:rtl w:val="0"/>
+          <w:lang w:val="en-US"/>
+        </w:rPr>
+        <w:t>עבורך</w:t>
+      </w:r>
+      <w:proofErr w:type="spellEnd"/>
+      <w:r>
+        <w:rPr>
+          <w:rtl w:val="0"/>
+          <w:lang w:val="en-US"/>
+        </w:rPr>
+        <w:t xml:space="preserve">, </w:t>
+      </w:r>
+      <w:proofErr w:type="spellStart"/>
+      <w:r>
+        <w:rPr>
+          <w:rtl w:val="0"/>
+          <w:lang w:val="en-US"/>
+        </w:rPr>
+        <w:t>בערכו</w:t>
+      </w:r>
+      <w:proofErr w:type="spellEnd"/>
+      <w:r>
+        <w:rPr>
+          <w:rtl w:val="0"/>
+          <w:lang w:val="en-US"/>
+        </w:rPr>
+        <w:t xml:space="preserve"> </w:t>
+      </w:r>
+      <w:proofErr w:type="spellStart"/>
+      <w:r>
+        <w:rPr>
+          <w:rtl w:val="0"/>
+          <w:lang w:val="en-US"/>
+        </w:rPr>
+        <w:t>הנומינאלי</w:t>
+      </w:r>
+      <w:proofErr w:type="spellEnd"/>
+      <w:r>
+        <w:rPr>
+          <w:rtl w:val="0"/>
+          <w:lang w:val="en-US"/>
+        </w:rPr>
+        <w:t>).</w:t>
       </w:r>
     </w:p>
     <w:p>
@@ -1725,7 +2926,34 @@
         <w:spacing w:after="40"/>
       </w:pPr>
       <w:r>
-        <w:t>אני מסכים/ה לקבלת הסכום הסופי בסך {{P}} לחשבון הבנק {{BANK_ACCOUNT}}, מאשר/ת קיזוז חובות כמפורט, ומוותר/ת על כל טענה עתידית.</w:t>
+        <w:t xml:space="preserve">אני מסכים/ה לקבלת הסכום הסופי בסך {{P}} לחשבון הבנק {{BANK_ACCOUNT}}, מאשר/ת קיזוז חובות כמפורט, ומוותר/ת על כל טענה </w:t>
+      </w:r>
+      <w:r>
+        <w:rPr>
+          <w:rFonts w:hint="cs"/>
+        </w:rPr>
+        <w:t xml:space="preserve"> </w:t>
+      </w:r>
+    </w:p>
+    <w:p>
+      <w:pPr>
+        <w:pStyle w:val="LGReceipt"/>
+        <w:spacing w:after="40"/>
+      </w:pPr>
+      <w:r>
+        <w:t>עתידית.</w:t>
+      </w:r>
+    </w:p>
+    <w:p>
+      <w:pPr>
+        <w:pStyle w:val="LGReceipt"/>
+        <w:spacing w:after="40"/>
+      </w:pPr>
+      <w:r>
+        <w:rPr>
+          <w:rtl w:val="0"/>
+        </w:rPr>
+        <w:t>אני מאשר/ת כי יתרות חובה בתקציב האישי, וחובות אחרים לקיבוץ, אם קיימים, יקוזזו מסכום התחשיב המועבר וישמשו לכיסוי חובותיי. עם קבלת סכום התחשיב בחשבוני כאמור, אין לי ולא תהיינה לי כל טענה, דרישה, או תביעה, כלפי קרן המילואים, חברי הקיבוץ ו/או כלפי הקיבוץ בקשר עם קביעת הזכויות, התחשיב וההסדר לקבלת סכום התחשיב האמור.</w:t>
       </w:r>
     </w:p>
     <w:p>

</xml_diff>